<commit_message>
Upgrade the remaining eight internship programs to enhanced 180-day curricula.
Import Downloads packages for Cyber, Data Science, Software Dev, Networking, Live Sound, Lighting, Screens/Video, and Intercom with unique daily topics, study notes, and regenerated handbooks.

Co-authored-by: Cursor <cursoragent@cursor.com>
</commit_message>
<xml_diff>
--- a/laravel-app/database/data/internship/handbooks/cyber_security/Beyond_CyberSecurity_Internship_Day_001_Student_Handbook.docx
+++ b/laravel-app/database/data/internship/handbooks/cyber_security/Beyond_CyberSecurity_Internship_Day_001_Student_Handbook.docx
@@ -38,7 +38,7 @@
           <w:color w:val="1E293B"/>
           <w:sz w:val="28"/>
         </w:rPr>
-        <w:t>Ethical Practice And Lab Isolation</w:t>
+        <w:t>Ethical Practice and Lab Isolation</w:t>
       </w:r>
     </w:p>
     <w:p>
@@ -167,7 +167,7 @@
               <w:rPr>
                 <w:sz w:val="18"/>
               </w:rPr>
-              <w:t>8 hours</w:t>
+              <w:t>8.0 hours</w:t>
             </w:r>
           </w:p>
         </w:tc>
@@ -180,7 +180,7 @@
               <w:rPr>
                 <w:sz w:val="18"/>
               </w:rPr>
-              <w:t>VirtualBox, Kali Linux, Ubuntu, Windows evaluation VMs, Wireshark and OWASP Juice Shop</w:t>
+              <w:t>VirtualBox, Kali Linux, Ubuntu/Windows VMs, Wireshark</w:t>
             </w:r>
           </w:p>
         </w:tc>
@@ -198,7 +198,7 @@
           <w:color w:val="0B3F90"/>
           <w:sz w:val="20"/>
         </w:rPr>
-        <w:t>Day 1 objective  Complete the orientation and setup for Ethical Practice And Lab Isolation: Apply ethical practice and lab isolation safely and explain the result in a professional technical report.</w:t>
+        <w:t>Day 1 objective  Complete the orientation and setup for Ethical Practice and Lab Isolation: Create a written authorization boundary and prove that Kali, Ubuntu, Windows evaluation VMs, Wireshark, and OWASP Juice Shop are isolated from production and third-party systems.</w:t>
       </w:r>
     </w:p>
     <w:p>
@@ -256,7 +256,7 @@
           <w:b w:val="0"/>
           <w:sz w:val="22"/>
         </w:rPr>
-        <w:t>Submit: A setup screenshot, a short explanation of the key terms, and a safety/ethics check..</w:t>
+        <w:t>Submit: Baseline evidence, completed practical artifact, independent verification, safety/restoration record, and short professional report..</w:t>
       </w:r>
     </w:p>
     <w:p>
@@ -687,7 +687,7 @@
           <w:b w:val="0"/>
           <w:sz w:val="20"/>
         </w:rPr>
-        <w:t>Curriculum objective (source of truth): Apply ethical practice and lab isolation safely and explain the result in a professional technical report.</w:t>
+        <w:t>Curriculum objective (source of truth): Create a written authorization boundary and prove that Kali, Ubuntu, Windows evaluation VMs, Wireshark, and OWASP Juice Shop are isolated from production and third-party systems.</w:t>
       </w:r>
     </w:p>
     <w:p>
@@ -699,7 +699,7 @@
           <w:b w:val="0"/>
           <w:sz w:val="22"/>
         </w:rPr>
-        <w:t>Explain Ethical Practice And Lab Isolation to a supervisor in under two minutes.</w:t>
+        <w:t>Explain Ethical Practice and Lab Isolation to a supervisor in under two minutes.</w:t>
       </w:r>
     </w:p>
     <w:p>
@@ -711,7 +711,7 @@
           <w:b w:val="0"/>
           <w:sz w:val="22"/>
         </w:rPr>
-        <w:t>Configure or verify the approved tools required for Ethical Practice And Lab Isolation.</w:t>
+        <w:t>Configure or verify the approved tools required for Ethical Practice and Lab Isolation.</w:t>
       </w:r>
     </w:p>
     <w:p>
@@ -779,7 +779,7 @@
           <w:b w:val="0"/>
           <w:sz w:val="22"/>
         </w:rPr>
-        <w:t>Define the professional meaning of “Ethical Practice And Lab Isolation” before you use tools. Do not split the title into meaningless words. Connect each concept to today's practical action.</w:t>
+        <w:t>Define the professional meaning of “Ethical Practice and Lab Isolation” before you use tools. Do not split the title into meaningless words. Connect each concept to today's practical action.</w:t>
       </w:r>
     </w:p>
     <w:tbl>
@@ -1334,7 +1334,7 @@
           <w:b w:val="0"/>
           <w:sz w:val="22"/>
         </w:rPr>
-        <w:t>Tools available: VirtualBox, Kali Linux, Ubuntu, Windows evaluation VMs, Wireshark and OWASP Juice Shop.</w:t>
+        <w:t>Tools available: VirtualBox, Kali Linux, Ubuntu/Windows VMs, Wireshark.</w:t>
       </w:r>
     </w:p>
     <w:p>
@@ -1663,7 +1663,7 @@
           <w:b w:val="0"/>
           <w:sz w:val="18"/>
         </w:rPr>
-        <w:t>└── Day_01_Ethical_Practice_And_Lab_Isolation/</w:t>
+        <w:t>└── Day_01_Ethical_Practice_and_Lab_Isolation/</w:t>
       </w:r>
     </w:p>
     <w:p>
@@ -1816,7 +1816,7 @@
           <w:b w:val="0"/>
           <w:sz w:val="18"/>
         </w:rPr>
-        <w:t>mkdir Beyond_CyberSecurity_Internship\Day_01_Ethical_Practice_And_Lab_Isolation\evidence, Beyond_CyberSecurity_Internship\Day_01_Ethical_Practice_And_Lab_Isolation\notebooks, Beyond_CyberSecurity_Internship\Day_01_Ethical_Practice_And_Lab_Isolation\src, Beyond_CyberSecurity_Internship\Day_01_Ethical_Practice_And_Lab_Isolation\data, Beyond_CyberSecurity_Internship\Day_01_Ethical_Practice_And_Lab_Isolation\output, Beyond_CyberSecurity_Internship\Day_01_Ethical_Practice_And_Lab_Isolation\report -Force</w:t>
+        <w:t>mkdir Beyond_CyberSecurity_Internship\Day_01_Ethical_Practice_and_Lab_Isolation\evidence, Beyond_CyberSecurity_Internship\Day_01_Ethical_Practice_and_Lab_Isolation\notebooks, Beyond_CyberSecurity_Internship\Day_01_Ethical_Practice_and_Lab_Isolation\src, Beyond_CyberSecurity_Internship\Day_01_Ethical_Practice_and_Lab_Isolation\data, Beyond_CyberSecurity_Internship\Day_01_Ethical_Practice_and_Lab_Isolation\output, Beyond_CyberSecurity_Internship\Day_01_Ethical_Practice_and_Lab_Isolation\report -Force</w:t>
       </w:r>
     </w:p>
     <w:p/>
@@ -1857,7 +1857,7 @@
           <w:b w:val="0"/>
           <w:sz w:val="18"/>
         </w:rPr>
-        <w:t>mkdir -p Beyond_CyberSecurity_Internship/Day_01_Ethical_Practice_And_Lab_Isolation/{evidence,notebooks,src,data,output,report}</w:t>
+        <w:t>mkdir -p Beyond_CyberSecurity_Internship/Day_01_Ethical_Practice_and_Lab_Isolation/{evidence,notebooks,src,data,output,report}</w:t>
       </w:r>
     </w:p>
     <w:p/>
@@ -1973,7 +1973,7 @@
           <w:color w:val="0B3F90"/>
           <w:sz w:val="24"/>
         </w:rPr>
-        <w:t>Orientation and setup: Ethical Practice And Lab Isolation</w:t>
+        <w:t>Orientation and setup: Ethical Practice and Lab Isolation</w:t>
       </w:r>
     </w:p>
     <w:p>
@@ -1997,7 +1997,7 @@
           <w:b w:val="0"/>
           <w:sz w:val="20"/>
         </w:rPr>
-        <w:t>• Read the Study Notes on this page, then create or verify the lab needed for ethical practice and lab isolation.</w:t>
+        <w:t>• Review the Day 1 scope, prerequisite from Day 0, and supervisor instructions before touching software, accounts, cables, power, rigging, networks, or equipment.</w:t>
       </w:r>
     </w:p>
     <w:p>
@@ -2009,7 +2009,7 @@
           <w:b w:val="0"/>
           <w:sz w:val="20"/>
         </w:rPr>
-        <w:t>• Work only in an authorized lab, VM or on equipment assigned by Beyond.</w:t>
+        <w:t>• Confirm the authorized lab/equipment boundary, owner, asset IDs, workspace condition, backup/rollback state, emergency procedure, and any PPE or spotter requirement.</w:t>
       </w:r>
     </w:p>
     <w:p>
@@ -2021,7 +2021,79 @@
           <w:b w:val="0"/>
           <w:sz w:val="20"/>
         </w:rPr>
-        <w:t>• Keep time entries truthful and ask the supervisor before changing production equipment.</w:t>
+        <w:t>• Verify only the approved tools for today: VirtualBox, Kali Linux, Ubuntu/Windows VMs, Wireshark. Record versions, firmware, serial/asset references, calibration status, or configuration as relevant. Avoid unnecessary installation or updates.</w:t>
+      </w:r>
+    </w:p>
+    <w:p>
+      <w:pPr>
+        <w:spacing w:after="120"/>
+      </w:pPr>
+      <w:r>
+        <w:rPr>
+          <w:b w:val="0"/>
+          <w:sz w:val="20"/>
+        </w:rPr>
+        <w:t>• Create Day_001_ethical_practice_and_lab_isolation with evidence, diagrams or src, checklists or tests, output, and report folders.</w:t>
+      </w:r>
+    </w:p>
+    <w:p>
+      <w:pPr>
+        <w:spacing w:after="120"/>
+      </w:pPr>
+      <w:r>
+        <w:rPr>
+          <w:b w:val="0"/>
+          <w:sz w:val="20"/>
+        </w:rPr>
+        <w:t>• Capture a privacy-reviewed baseline photograph/screenshot and record expected result, measurement units, acceptance limit, and stop condition.</w:t>
+      </w:r>
+    </w:p>
+    <w:p>
+      <w:pPr>
+        <w:spacing w:after="120"/>
+      </w:pPr>
+      <w:r>
+        <w:rPr>
+          <w:b w:val="0"/>
+          <w:sz w:val="20"/>
+        </w:rPr>
+        <w:t>• Complete the practical objective: Create a written authorization boundary and prove that Kali, Ubuntu, Windows evaluation VMs, Wireshark, and OWASP Juice Shop are isolated from production and third-party systems.</w:t>
+      </w:r>
+    </w:p>
+    <w:p>
+      <w:pPr>
+        <w:spacing w:after="120"/>
+      </w:pPr>
+      <w:r>
+        <w:rPr>
+          <w:b w:val="0"/>
+          <w:sz w:val="20"/>
+        </w:rPr>
+        <w:t>• Introduce or analyze only an approved controlled fault/edge case. Troubleshoot systematically, preserve evidence, and return the lab/equipment to its approved state.</w:t>
+      </w:r>
+    </w:p>
+    <w:p>
+      <w:pPr>
+        <w:spacing w:after="120"/>
+      </w:pPr>
+      <w:r>
+        <w:rPr>
+          <w:b w:val="0"/>
+          <w:sz w:val="20"/>
+        </w:rPr>
+        <w:t>• Verify independently through a second instrument/path/test, clean rerun, configuration comparison, peer check, or supervisor sign-off. Distinguish evidence from proof.</w:t>
+      </w:r>
+    </w:p>
+    <w:p>
+      <w:pPr>
+        <w:spacing w:after="120"/>
+      </w:pPr>
+      <w:r>
+        <w:rPr>
+          <w:b w:val="0"/>
+          <w:sz w:val="20"/>
+        </w:rPr>
+        <w:t>• Complete the discipline safety/ethics checklist, inventory/custody or cleanup check, and a professional report with honest limitations and assistance disclosure.</w:t>
       </w:r>
     </w:p>
     <w:p>
@@ -2047,7 +2119,7 @@
           <w:b w:val="0"/>
           <w:sz w:val="18"/>
         </w:rPr>
-        <w:t># day_01_lab.py — Orientation and setup: Ethical Practice And Lab Isolation</w:t>
+        <w:t># day_01_lab.py — Orientation and setup: Ethical Practice and Lab Isolation</w:t>
       </w:r>
     </w:p>
     <w:p>
@@ -2089,7 +2161,7 @@
           <w:b w:val="0"/>
           <w:sz w:val="18"/>
         </w:rPr>
-        <w:t>"""Day 1 practical starter for Ethical Practice And Lab Isolation.</w:t>
+        <w:t>"""Day 1 practical starter for Ethical Practice and Lab Isolation.</w:t>
       </w:r>
     </w:p>
     <w:p>
@@ -2271,7 +2343,7 @@
           <w:b w:val="0"/>
           <w:sz w:val="18"/>
         </w:rPr>
-        <w:t xml:space="preserve">    print("Program topic:", 'Ethical Practice And Lab Isolation')</w:t>
+        <w:t xml:space="preserve">    print("Program topic:", 'Ethical Practice and Lab Isolation')</w:t>
       </w:r>
     </w:p>
     <w:p>
@@ -5890,7 +5962,7 @@
           <w:b w:val="0"/>
           <w:sz w:val="22"/>
         </w:rPr>
-        <w:t>Objective addressed for Ethical Practice And Lab Isolation</w:t>
+        <w:t>Objective addressed for Ethical Practice and Lab Isolation</w:t>
       </w:r>
     </w:p>
     <w:p>
@@ -5994,7 +6066,7 @@
           <w:b w:val="0"/>
           <w:sz w:val="22"/>
         </w:rPr>
-        <w:t>Matches: A setup screenshot, a short explanation of the key terms, and a safety/ethics check.</w:t>
+        <w:t>Matches: Baseline evidence, completed practical artifact, independent verification, safety/restoration record, and short professional report.</w:t>
       </w:r>
     </w:p>
     <w:p>
@@ -6026,7 +6098,7 @@
           <w:b w:val="0"/>
           <w:sz w:val="22"/>
         </w:rPr>
-        <w:t>Explain Ethical Practice And Lab Isolation without reading.</w:t>
+        <w:t>Explain Ethical Practice and Lab Isolation without reading.</w:t>
       </w:r>
     </w:p>
     <w:p>
@@ -6118,7 +6190,7 @@
           <w:b w:val="0"/>
           <w:sz w:val="22"/>
         </w:rPr>
-        <w:t>Today is Day 1 (Orientation and setup) on Ethical Practice And Lab Isolation. I worked only in the authorized Beyond cybersecurity lab. I completed the practical objective, verified with a second check, and packaged evidence. Main risk: unauthorized or unsafe action; control: checklist + supervisor escalation. Limitation: classroom/lab scope only. Next: continue the topic cycle and keep documentation reproducible.</w:t>
+        <w:t>Today is Day 1 (Orientation and setup) on Ethical Practice and Lab Isolation. I worked only in the authorized Beyond cybersecurity lab. I completed the practical objective, verified with a second check, and packaged evidence. Main risk: unauthorized or unsafe action; control: checklist + supervisor escalation. Limitation: classroom/lab scope only. Next: continue the topic cycle and keep documentation reproducible.</w:t>
       </w:r>
     </w:p>
     <w:p>
@@ -6549,7 +6621,7 @@
           <w:b w:val="0"/>
           <w:sz w:val="22"/>
         </w:rPr>
-        <w:t>Access check date: 2026-08-09. Prefer first-party sources. Do not invent URLs.</w:t>
+        <w:t>Access check date: 2026-08-10. Prefer first-party sources. Do not invent URLs.</w:t>
       </w:r>
     </w:p>
     <w:p>

</xml_diff>